<commit_message>
Use building names without model codes in Word plans
</commit_message>
<xml_diff>
--- a/public/templates/building-production-plan.docx
+++ b/public/templates/building-production-plan.docx
@@ -89,9 +89,9 @@
         <w:spacing w:after="20"/>
         <w:jc w:val="center"/>
         <w:rPr>
-          <w:rFonts w:ascii="SimSun" w:eastAsia="SimSun" w:hAnsi="SimSun" w:cs="Noto Sans CJK TC" w:hint="eastAsia"/>
+          <w:rFonts w:ascii="SimSun" w:eastAsia="SimSun" w:hAnsi="SimSun" w:cs="Noto Sans CJK TC"/>
           <w:b/>
-          <w:lang w:eastAsia="zh-CN"/>
+          <w:lang w:eastAsia="zh-TW"/>
         </w:rPr>
       </w:pPr>
       <w:r>
@@ -245,7 +245,7 @@
                 <w:b/>
                 <w:lang w:eastAsia="zh-TW"/>
               </w:rPr>
-              <w:t>1. B1、B2、B3… 是每座建築的編號。</w:t>
+              <w:t>1. B1、B2、B3… 是每座建築的編號；建築物類型請填名稱。</w:t>
             </w:r>
           </w:p>
         </w:tc>
@@ -1407,7 +1407,6 @@
           <w:p>
             <w:pPr>
               <w:spacing w:after="0" w:line="600" w:lineRule="auto"/>
-              <w:jc w:val="center"/>
               <w:rPr>
                 <w:rFonts w:ascii="新細明體" w:eastAsia="新細明體" w:hAnsi="新細明體"/>
                 <w:b/>

</xml_diff>

<commit_message>
Sync production plan to updated Word filename format
</commit_message>
<xml_diff>
--- a/public/templates/building-production-plan.docx
+++ b/public/templates/building-production-plan.docx
@@ -286,7 +286,7 @@
                 <w:b/>
                 <w:lang w:eastAsia="zh-TW"/>
               </w:rPr>
-              <w:t>2. 檔案名稱格式：班別_組別_建築編號_數量                                                                     例子：2B_GROUP 2_B1_1</w:t>
+              <w:t>2. 檔案名稱格式：班別_組別_建築編號                                                                     例子：2B_GROUP 2_B1</w:t>
             </w:r>
           </w:p>
         </w:tc>
@@ -354,7 +354,6 @@
                 <w:b/>
               </w:rPr>
             </w:pPr>
-            <w:proofErr w:type="spellStart"/>
             <w:r>
               <w:rPr>
                 <w:rFonts w:ascii="新細明體" w:eastAsia="新細明體" w:hAnsi="新細明體" w:cs="Noto Sans CJK TC"/>
@@ -362,7 +361,6 @@
               </w:rPr>
               <w:t>編號</w:t>
             </w:r>
-            <w:proofErr w:type="spellEnd"/>
           </w:p>
         </w:tc>
         <w:tc>
@@ -391,7 +389,6 @@
                 <w:b/>
               </w:rPr>
             </w:pPr>
-            <w:proofErr w:type="spellStart"/>
             <w:r>
               <w:rPr>
                 <w:rFonts w:ascii="新細明體" w:eastAsia="新細明體" w:hAnsi="新細明體" w:cs="Noto Sans CJK TC"/>
@@ -399,7 +396,6 @@
               </w:rPr>
               <w:t>建築物類型</w:t>
             </w:r>
-            <w:proofErr w:type="spellEnd"/>
           </w:p>
         </w:tc>
         <w:tc>
@@ -428,7 +424,6 @@
                 <w:b/>
               </w:rPr>
             </w:pPr>
-            <w:proofErr w:type="spellStart"/>
             <w:r>
               <w:rPr>
                 <w:rFonts w:ascii="新細明體" w:eastAsia="新細明體" w:hAnsi="新細明體" w:cs="Noto Sans CJK TC"/>
@@ -436,7 +431,6 @@
               </w:rPr>
               <w:t>數量</w:t>
             </w:r>
-            <w:proofErr w:type="spellEnd"/>
           </w:p>
         </w:tc>
         <w:tc>
@@ -594,7 +588,6 @@
                 <w:b/>
               </w:rPr>
             </w:pPr>
-            <w:proofErr w:type="spellStart"/>
             <w:r>
               <w:rPr>
                 <w:rFonts w:ascii="新細明體" w:eastAsia="新細明體" w:hAnsi="新細明體" w:cs="Noto Sans CJK TC"/>
@@ -602,7 +595,6 @@
               </w:rPr>
               <w:t>製作方法</w:t>
             </w:r>
-            <w:proofErr w:type="spellEnd"/>
           </w:p>
         </w:tc>
         <w:tc>
@@ -661,7 +653,6 @@
                 <w:b/>
               </w:rPr>
             </w:pPr>
-            <w:proofErr w:type="spellStart"/>
             <w:r>
               <w:rPr>
                 <w:rFonts w:ascii="新細明體" w:eastAsia="新細明體" w:hAnsi="新細明體" w:cs="Noto Sans CJK TC"/>
@@ -669,7 +660,6 @@
               </w:rPr>
               <w:t>檔案名稱</w:t>
             </w:r>
-            <w:proofErr w:type="spellEnd"/>
           </w:p>
         </w:tc>
         <w:tc>
@@ -788,7 +778,6 @@
                 <w:b/>
               </w:rPr>
             </w:pPr>
-            <w:proofErr w:type="spellStart"/>
             <w:r>
               <w:rPr>
                 <w:rFonts w:ascii="新細明體" w:eastAsia="新細明體" w:hAnsi="新細明體" w:cs="Noto Sans CJK TC"/>
@@ -796,7 +785,6 @@
               </w:rPr>
               <w:t>例子</w:t>
             </w:r>
-            <w:proofErr w:type="spellEnd"/>
           </w:p>
         </w:tc>
         <w:tc>
@@ -825,7 +813,6 @@
                 <w:b/>
               </w:rPr>
             </w:pPr>
-            <w:proofErr w:type="spellStart"/>
             <w:r>
               <w:rPr>
                 <w:rFonts w:ascii="新細明體" w:eastAsia="新細明體" w:hAnsi="新細明體" w:cs="Noto Sans CJK TC"/>
@@ -833,7 +820,6 @@
               </w:rPr>
               <w:t>住宅</w:t>
             </w:r>
-            <w:proofErr w:type="spellEnd"/>
           </w:p>
         </w:tc>
         <w:tc>
@@ -1086,15 +1072,7 @@
                 <w:rFonts w:ascii="新細明體" w:eastAsia="新細明體" w:hAnsi="新細明體" w:cs="Noto Sans CJK TC"/>
                 <w:b/>
               </w:rPr>
-              <w:t>2B_GROUP 2_B1_</w:t>
-            </w:r>
-            <w:r>
-              <w:rPr>
-                <w:rFonts w:ascii="新細明體" w:eastAsia="新細明體" w:hAnsi="新細明體" w:cs="Noto Sans CJK TC" w:hint="eastAsia"/>
-                <w:b/>
-                <w:lang w:eastAsia="zh-TW"/>
-              </w:rPr>
-              <w:t>2</w:t>
+              <w:t>2B_GROUP 2_B1</w:t>
             </w:r>
           </w:p>
         </w:tc>
@@ -1413,7 +1391,6 @@
                 <w:lang w:eastAsia="zh-CN"/>
               </w:rPr>
             </w:pPr>
-            <w:proofErr w:type="gramStart"/>
             <w:r>
               <w:rPr>
                 <w:rFonts w:ascii="新細明體" w:eastAsia="新細明體" w:hAnsi="新細明體" w:cs="Noto Sans CJK TC"/>
@@ -1427,27 +1404,8 @@
                 <w:b/>
                 <w:lang w:eastAsia="zh-CN"/>
               </w:rPr>
-              <w:t xml:space="preserve">(  </w:t>
+              <w:t>(     )</w:t>
             </w:r>
-            <w:proofErr w:type="gramEnd"/>
-            <w:r>
-              <w:rPr>
-                <w:rFonts w:ascii="新細明體" w:eastAsia="新細明體" w:hAnsi="新細明體" w:cs="Noto Sans CJK TC" w:hint="eastAsia"/>
-                <w:b/>
-                <w:lang w:eastAsia="zh-CN"/>
-              </w:rPr>
-              <w:t xml:space="preserve"> </w:t>
-            </w:r>
-            <w:proofErr w:type="gramStart"/>
-            <w:r>
-              <w:rPr>
-                <w:rFonts w:ascii="新細明體" w:eastAsia="新細明體" w:hAnsi="新細明體" w:cs="Noto Sans CJK TC" w:hint="eastAsia"/>
-                <w:b/>
-                <w:lang w:eastAsia="zh-CN"/>
-              </w:rPr>
-              <w:t xml:space="preserve">  )</w:t>
-            </w:r>
-            <w:proofErr w:type="gramEnd"/>
             <w:r>
               <w:rPr>
                 <w:rFonts w:ascii="新細明體" w:eastAsia="新細明體" w:hAnsi="新細明體" w:cs="Noto Sans CJK TC"/>
@@ -1455,7 +1413,6 @@
               </w:rPr>
               <w:t xml:space="preserve">_GROUP </w:t>
             </w:r>
-            <w:proofErr w:type="gramStart"/>
             <w:r>
               <w:rPr>
                 <w:rFonts w:ascii="新細明體" w:eastAsia="新細明體" w:hAnsi="新細明體" w:cs="Noto Sans CJK TC" w:hint="eastAsia"/>
@@ -1464,7 +1421,6 @@
               </w:rPr>
               <w:t>(    )</w:t>
             </w:r>
-            <w:proofErr w:type="gramEnd"/>
             <w:r>
               <w:rPr>
                 <w:rFonts w:ascii="新細明體" w:eastAsia="新細明體" w:hAnsi="新細明體" w:cs="Noto Sans CJK TC"/>
@@ -1472,23 +1428,6 @@
               </w:rPr>
               <w:t>_B1</w:t>
             </w:r>
-            <w:proofErr w:type="gramStart"/>
-            <w:r>
-              <w:rPr>
-                <w:rFonts w:ascii="新細明體" w:eastAsia="新細明體" w:hAnsi="新細明體" w:cs="Noto Sans CJK TC"/>
-                <w:b/>
-              </w:rPr>
-              <w:t>_</w:t>
-            </w:r>
-            <w:r>
-              <w:rPr>
-                <w:rFonts w:ascii="新細明體" w:eastAsia="新細明體" w:hAnsi="新細明體" w:cs="Noto Sans CJK TC" w:hint="eastAsia"/>
-                <w:b/>
-                <w:lang w:eastAsia="zh-CN"/>
-              </w:rPr>
-              <w:t>(    )</w:t>
-            </w:r>
-            <w:proofErr w:type="gramEnd"/>
           </w:p>
         </w:tc>
         <w:tc>
@@ -1784,7 +1723,6 @@
                 <w:b/>
               </w:rPr>
             </w:pPr>
-            <w:proofErr w:type="gramStart"/>
             <w:r>
               <w:rPr>
                 <w:rFonts w:ascii="新細明體" w:eastAsia="新細明體" w:hAnsi="新細明體" w:cs="Noto Sans CJK TC"/>
@@ -1798,27 +1736,8 @@
                 <w:b/>
                 <w:lang w:eastAsia="zh-CN"/>
               </w:rPr>
-              <w:t xml:space="preserve">(  </w:t>
+              <w:t>(     )</w:t>
             </w:r>
-            <w:proofErr w:type="gramEnd"/>
-            <w:r>
-              <w:rPr>
-                <w:rFonts w:ascii="新細明體" w:eastAsia="新細明體" w:hAnsi="新細明體" w:cs="Noto Sans CJK TC" w:hint="eastAsia"/>
-                <w:b/>
-                <w:lang w:eastAsia="zh-CN"/>
-              </w:rPr>
-              <w:t xml:space="preserve"> </w:t>
-            </w:r>
-            <w:proofErr w:type="gramStart"/>
-            <w:r>
-              <w:rPr>
-                <w:rFonts w:ascii="新細明體" w:eastAsia="新細明體" w:hAnsi="新細明體" w:cs="Noto Sans CJK TC" w:hint="eastAsia"/>
-                <w:b/>
-                <w:lang w:eastAsia="zh-CN"/>
-              </w:rPr>
-              <w:t xml:space="preserve">  )</w:t>
-            </w:r>
-            <w:proofErr w:type="gramEnd"/>
             <w:r>
               <w:rPr>
                 <w:rFonts w:ascii="新細明體" w:eastAsia="新細明體" w:hAnsi="新細明體" w:cs="Noto Sans CJK TC"/>
@@ -1826,7 +1745,6 @@
               </w:rPr>
               <w:t xml:space="preserve">_GROUP </w:t>
             </w:r>
-            <w:proofErr w:type="gramStart"/>
             <w:r>
               <w:rPr>
                 <w:rFonts w:ascii="新細明體" w:eastAsia="新細明體" w:hAnsi="新細明體" w:cs="Noto Sans CJK TC" w:hint="eastAsia"/>
@@ -1835,7 +1753,6 @@
               </w:rPr>
               <w:t>(    )</w:t>
             </w:r>
-            <w:proofErr w:type="gramEnd"/>
             <w:r>
               <w:rPr>
                 <w:rFonts w:ascii="新細明體" w:eastAsia="新細明體" w:hAnsi="新細明體" w:cs="Noto Sans CJK TC"/>
@@ -1851,23 +1768,6 @@
               </w:rPr>
               <w:t>2</w:t>
             </w:r>
-            <w:proofErr w:type="gramStart"/>
-            <w:r>
-              <w:rPr>
-                <w:rFonts w:ascii="新細明體" w:eastAsia="新細明體" w:hAnsi="新細明體" w:cs="Noto Sans CJK TC"/>
-                <w:b/>
-              </w:rPr>
-              <w:t>_</w:t>
-            </w:r>
-            <w:r>
-              <w:rPr>
-                <w:rFonts w:ascii="新細明體" w:eastAsia="新細明體" w:hAnsi="新細明體" w:cs="Noto Sans CJK TC" w:hint="eastAsia"/>
-                <w:b/>
-                <w:lang w:eastAsia="zh-CN"/>
-              </w:rPr>
-              <w:t>(    )</w:t>
-            </w:r>
-            <w:proofErr w:type="gramEnd"/>
           </w:p>
         </w:tc>
         <w:tc>
@@ -2163,7 +2063,6 @@
                 <w:b/>
               </w:rPr>
             </w:pPr>
-            <w:proofErr w:type="gramStart"/>
             <w:r>
               <w:rPr>
                 <w:rFonts w:ascii="新細明體" w:eastAsia="新細明體" w:hAnsi="新細明體" w:cs="Noto Sans CJK TC"/>
@@ -2177,27 +2076,8 @@
                 <w:b/>
                 <w:lang w:eastAsia="zh-CN"/>
               </w:rPr>
-              <w:t xml:space="preserve">(  </w:t>
+              <w:t>(     )</w:t>
             </w:r>
-            <w:proofErr w:type="gramEnd"/>
-            <w:r>
-              <w:rPr>
-                <w:rFonts w:ascii="新細明體" w:eastAsia="新細明體" w:hAnsi="新細明體" w:cs="Noto Sans CJK TC" w:hint="eastAsia"/>
-                <w:b/>
-                <w:lang w:eastAsia="zh-CN"/>
-              </w:rPr>
-              <w:t xml:space="preserve"> </w:t>
-            </w:r>
-            <w:proofErr w:type="gramStart"/>
-            <w:r>
-              <w:rPr>
-                <w:rFonts w:ascii="新細明體" w:eastAsia="新細明體" w:hAnsi="新細明體" w:cs="Noto Sans CJK TC" w:hint="eastAsia"/>
-                <w:b/>
-                <w:lang w:eastAsia="zh-CN"/>
-              </w:rPr>
-              <w:t xml:space="preserve">  )</w:t>
-            </w:r>
-            <w:proofErr w:type="gramEnd"/>
             <w:r>
               <w:rPr>
                 <w:rFonts w:ascii="新細明體" w:eastAsia="新細明體" w:hAnsi="新細明體" w:cs="Noto Sans CJK TC"/>
@@ -2205,7 +2085,6 @@
               </w:rPr>
               <w:t xml:space="preserve">_GROUP </w:t>
             </w:r>
-            <w:proofErr w:type="gramStart"/>
             <w:r>
               <w:rPr>
                 <w:rFonts w:ascii="新細明體" w:eastAsia="新細明體" w:hAnsi="新細明體" w:cs="Noto Sans CJK TC" w:hint="eastAsia"/>
@@ -2214,7 +2093,6 @@
               </w:rPr>
               <w:t>(    )</w:t>
             </w:r>
-            <w:proofErr w:type="gramEnd"/>
             <w:r>
               <w:rPr>
                 <w:rFonts w:ascii="新細明體" w:eastAsia="新細明體" w:hAnsi="新細明體" w:cs="Noto Sans CJK TC"/>
@@ -2230,23 +2108,6 @@
               </w:rPr>
               <w:t>3</w:t>
             </w:r>
-            <w:proofErr w:type="gramStart"/>
-            <w:r>
-              <w:rPr>
-                <w:rFonts w:ascii="新細明體" w:eastAsia="新細明體" w:hAnsi="新細明體" w:cs="Noto Sans CJK TC"/>
-                <w:b/>
-              </w:rPr>
-              <w:t>_</w:t>
-            </w:r>
-            <w:r>
-              <w:rPr>
-                <w:rFonts w:ascii="新細明體" w:eastAsia="新細明體" w:hAnsi="新細明體" w:cs="Noto Sans CJK TC" w:hint="eastAsia"/>
-                <w:b/>
-                <w:lang w:eastAsia="zh-CN"/>
-              </w:rPr>
-              <w:t>(    )</w:t>
-            </w:r>
-            <w:proofErr w:type="gramEnd"/>
           </w:p>
         </w:tc>
         <w:tc>
@@ -2542,7 +2403,6 @@
                 <w:b/>
               </w:rPr>
             </w:pPr>
-            <w:proofErr w:type="gramStart"/>
             <w:r>
               <w:rPr>
                 <w:rFonts w:ascii="新細明體" w:eastAsia="新細明體" w:hAnsi="新細明體" w:cs="Noto Sans CJK TC"/>
@@ -2556,27 +2416,8 @@
                 <w:b/>
                 <w:lang w:eastAsia="zh-CN"/>
               </w:rPr>
-              <w:t xml:space="preserve">(  </w:t>
+              <w:t>(     )</w:t>
             </w:r>
-            <w:proofErr w:type="gramEnd"/>
-            <w:r>
-              <w:rPr>
-                <w:rFonts w:ascii="新細明體" w:eastAsia="新細明體" w:hAnsi="新細明體" w:cs="Noto Sans CJK TC" w:hint="eastAsia"/>
-                <w:b/>
-                <w:lang w:eastAsia="zh-CN"/>
-              </w:rPr>
-              <w:t xml:space="preserve"> </w:t>
-            </w:r>
-            <w:proofErr w:type="gramStart"/>
-            <w:r>
-              <w:rPr>
-                <w:rFonts w:ascii="新細明體" w:eastAsia="新細明體" w:hAnsi="新細明體" w:cs="Noto Sans CJK TC" w:hint="eastAsia"/>
-                <w:b/>
-                <w:lang w:eastAsia="zh-CN"/>
-              </w:rPr>
-              <w:t xml:space="preserve">  )</w:t>
-            </w:r>
-            <w:proofErr w:type="gramEnd"/>
             <w:r>
               <w:rPr>
                 <w:rFonts w:ascii="新細明體" w:eastAsia="新細明體" w:hAnsi="新細明體" w:cs="Noto Sans CJK TC"/>
@@ -2584,7 +2425,6 @@
               </w:rPr>
               <w:t xml:space="preserve">_GROUP </w:t>
             </w:r>
-            <w:proofErr w:type="gramStart"/>
             <w:r>
               <w:rPr>
                 <w:rFonts w:ascii="新細明體" w:eastAsia="新細明體" w:hAnsi="新細明體" w:cs="Noto Sans CJK TC" w:hint="eastAsia"/>
@@ -2593,7 +2433,6 @@
               </w:rPr>
               <w:t>(    )</w:t>
             </w:r>
-            <w:proofErr w:type="gramEnd"/>
             <w:r>
               <w:rPr>
                 <w:rFonts w:ascii="新細明體" w:eastAsia="新細明體" w:hAnsi="新細明體" w:cs="Noto Sans CJK TC"/>
@@ -2609,23 +2448,6 @@
               </w:rPr>
               <w:t>4</w:t>
             </w:r>
-            <w:proofErr w:type="gramStart"/>
-            <w:r>
-              <w:rPr>
-                <w:rFonts w:ascii="新細明體" w:eastAsia="新細明體" w:hAnsi="新細明體" w:cs="Noto Sans CJK TC"/>
-                <w:b/>
-              </w:rPr>
-              <w:t>_</w:t>
-            </w:r>
-            <w:r>
-              <w:rPr>
-                <w:rFonts w:ascii="新細明體" w:eastAsia="新細明體" w:hAnsi="新細明體" w:cs="Noto Sans CJK TC" w:hint="eastAsia"/>
-                <w:b/>
-                <w:lang w:eastAsia="zh-CN"/>
-              </w:rPr>
-              <w:t>(    )</w:t>
-            </w:r>
-            <w:proofErr w:type="gramEnd"/>
           </w:p>
         </w:tc>
         <w:tc>
@@ -2921,7 +2743,6 @@
                 <w:b/>
               </w:rPr>
             </w:pPr>
-            <w:proofErr w:type="gramStart"/>
             <w:r>
               <w:rPr>
                 <w:rFonts w:ascii="新細明體" w:eastAsia="新細明體" w:hAnsi="新細明體" w:cs="Noto Sans CJK TC"/>
@@ -2935,27 +2756,8 @@
                 <w:b/>
                 <w:lang w:eastAsia="zh-CN"/>
               </w:rPr>
-              <w:t xml:space="preserve">(  </w:t>
+              <w:t>(     )</w:t>
             </w:r>
-            <w:proofErr w:type="gramEnd"/>
-            <w:r>
-              <w:rPr>
-                <w:rFonts w:ascii="新細明體" w:eastAsia="新細明體" w:hAnsi="新細明體" w:cs="Noto Sans CJK TC" w:hint="eastAsia"/>
-                <w:b/>
-                <w:lang w:eastAsia="zh-CN"/>
-              </w:rPr>
-              <w:t xml:space="preserve"> </w:t>
-            </w:r>
-            <w:proofErr w:type="gramStart"/>
-            <w:r>
-              <w:rPr>
-                <w:rFonts w:ascii="新細明體" w:eastAsia="新細明體" w:hAnsi="新細明體" w:cs="Noto Sans CJK TC" w:hint="eastAsia"/>
-                <w:b/>
-                <w:lang w:eastAsia="zh-CN"/>
-              </w:rPr>
-              <w:t xml:space="preserve">  )</w:t>
-            </w:r>
-            <w:proofErr w:type="gramEnd"/>
             <w:r>
               <w:rPr>
                 <w:rFonts w:ascii="新細明體" w:eastAsia="新細明體" w:hAnsi="新細明體" w:cs="Noto Sans CJK TC"/>
@@ -2963,7 +2765,6 @@
               </w:rPr>
               <w:t xml:space="preserve">_GROUP </w:t>
             </w:r>
-            <w:proofErr w:type="gramStart"/>
             <w:r>
               <w:rPr>
                 <w:rFonts w:ascii="新細明體" w:eastAsia="新細明體" w:hAnsi="新細明體" w:cs="Noto Sans CJK TC" w:hint="eastAsia"/>
@@ -2972,7 +2773,6 @@
               </w:rPr>
               <w:t>(    )</w:t>
             </w:r>
-            <w:proofErr w:type="gramEnd"/>
             <w:r>
               <w:rPr>
                 <w:rFonts w:ascii="新細明體" w:eastAsia="新細明體" w:hAnsi="新細明體" w:cs="Noto Sans CJK TC"/>
@@ -2988,23 +2788,6 @@
               </w:rPr>
               <w:t>5</w:t>
             </w:r>
-            <w:proofErr w:type="gramStart"/>
-            <w:r>
-              <w:rPr>
-                <w:rFonts w:ascii="新細明體" w:eastAsia="新細明體" w:hAnsi="新細明體" w:cs="Noto Sans CJK TC"/>
-                <w:b/>
-              </w:rPr>
-              <w:t>_</w:t>
-            </w:r>
-            <w:r>
-              <w:rPr>
-                <w:rFonts w:ascii="新細明體" w:eastAsia="新細明體" w:hAnsi="新細明體" w:cs="Noto Sans CJK TC" w:hint="eastAsia"/>
-                <w:b/>
-                <w:lang w:eastAsia="zh-CN"/>
-              </w:rPr>
-              <w:t>(    )</w:t>
-            </w:r>
-            <w:proofErr w:type="gramEnd"/>
           </w:p>
         </w:tc>
         <w:tc>
@@ -3301,7 +3084,6 @@
                 <w:b/>
               </w:rPr>
             </w:pPr>
-            <w:proofErr w:type="gramStart"/>
             <w:r>
               <w:rPr>
                 <w:rFonts w:ascii="新細明體" w:eastAsia="新細明體" w:hAnsi="新細明體" w:cs="Noto Sans CJK TC"/>
@@ -3315,27 +3097,8 @@
                 <w:b/>
                 <w:lang w:eastAsia="zh-CN"/>
               </w:rPr>
-              <w:t xml:space="preserve">(  </w:t>
+              <w:t>(     )</w:t>
             </w:r>
-            <w:proofErr w:type="gramEnd"/>
-            <w:r>
-              <w:rPr>
-                <w:rFonts w:ascii="新細明體" w:eastAsia="新細明體" w:hAnsi="新細明體" w:cs="Noto Sans CJK TC" w:hint="eastAsia"/>
-                <w:b/>
-                <w:lang w:eastAsia="zh-CN"/>
-              </w:rPr>
-              <w:t xml:space="preserve"> </w:t>
-            </w:r>
-            <w:proofErr w:type="gramStart"/>
-            <w:r>
-              <w:rPr>
-                <w:rFonts w:ascii="新細明體" w:eastAsia="新細明體" w:hAnsi="新細明體" w:cs="Noto Sans CJK TC" w:hint="eastAsia"/>
-                <w:b/>
-                <w:lang w:eastAsia="zh-CN"/>
-              </w:rPr>
-              <w:t xml:space="preserve">  )</w:t>
-            </w:r>
-            <w:proofErr w:type="gramEnd"/>
             <w:r>
               <w:rPr>
                 <w:rFonts w:ascii="新細明體" w:eastAsia="新細明體" w:hAnsi="新細明體" w:cs="Noto Sans CJK TC"/>
@@ -3343,7 +3106,6 @@
               </w:rPr>
               <w:t xml:space="preserve">_GROUP </w:t>
             </w:r>
-            <w:proofErr w:type="gramStart"/>
             <w:r>
               <w:rPr>
                 <w:rFonts w:ascii="新細明體" w:eastAsia="新細明體" w:hAnsi="新細明體" w:cs="Noto Sans CJK TC" w:hint="eastAsia"/>
@@ -3352,7 +3114,6 @@
               </w:rPr>
               <w:t>(    )</w:t>
             </w:r>
-            <w:proofErr w:type="gramEnd"/>
             <w:r>
               <w:rPr>
                 <w:rFonts w:ascii="新細明體" w:eastAsia="新細明體" w:hAnsi="新細明體" w:cs="Noto Sans CJK TC"/>
@@ -3368,23 +3129,6 @@
               </w:rPr>
               <w:t>6</w:t>
             </w:r>
-            <w:proofErr w:type="gramStart"/>
-            <w:r>
-              <w:rPr>
-                <w:rFonts w:ascii="新細明體" w:eastAsia="新細明體" w:hAnsi="新細明體" w:cs="Noto Sans CJK TC"/>
-                <w:b/>
-              </w:rPr>
-              <w:t>_</w:t>
-            </w:r>
-            <w:r>
-              <w:rPr>
-                <w:rFonts w:ascii="新細明體" w:eastAsia="新細明體" w:hAnsi="新細明體" w:cs="Noto Sans CJK TC" w:hint="eastAsia"/>
-                <w:b/>
-                <w:lang w:eastAsia="zh-CN"/>
-              </w:rPr>
-              <w:t>(    )</w:t>
-            </w:r>
-            <w:proofErr w:type="gramEnd"/>
           </w:p>
         </w:tc>
         <w:tc>
@@ -3680,7 +3424,6 @@
                 <w:b/>
               </w:rPr>
             </w:pPr>
-            <w:proofErr w:type="gramStart"/>
             <w:r>
               <w:rPr>
                 <w:rFonts w:ascii="新細明體" w:eastAsia="新細明體" w:hAnsi="新細明體" w:cs="Noto Sans CJK TC"/>
@@ -3694,27 +3437,8 @@
                 <w:b/>
                 <w:lang w:eastAsia="zh-CN"/>
               </w:rPr>
-              <w:t xml:space="preserve">(  </w:t>
+              <w:t>(     )</w:t>
             </w:r>
-            <w:proofErr w:type="gramEnd"/>
-            <w:r>
-              <w:rPr>
-                <w:rFonts w:ascii="新細明體" w:eastAsia="新細明體" w:hAnsi="新細明體" w:cs="Noto Sans CJK TC" w:hint="eastAsia"/>
-                <w:b/>
-                <w:lang w:eastAsia="zh-CN"/>
-              </w:rPr>
-              <w:t xml:space="preserve"> </w:t>
-            </w:r>
-            <w:proofErr w:type="gramStart"/>
-            <w:r>
-              <w:rPr>
-                <w:rFonts w:ascii="新細明體" w:eastAsia="新細明體" w:hAnsi="新細明體" w:cs="Noto Sans CJK TC" w:hint="eastAsia"/>
-                <w:b/>
-                <w:lang w:eastAsia="zh-CN"/>
-              </w:rPr>
-              <w:t xml:space="preserve">  )</w:t>
-            </w:r>
-            <w:proofErr w:type="gramEnd"/>
             <w:r>
               <w:rPr>
                 <w:rFonts w:ascii="新細明體" w:eastAsia="新細明體" w:hAnsi="新細明體" w:cs="Noto Sans CJK TC"/>
@@ -3722,7 +3446,6 @@
               </w:rPr>
               <w:t xml:space="preserve">_GROUP </w:t>
             </w:r>
-            <w:proofErr w:type="gramStart"/>
             <w:r>
               <w:rPr>
                 <w:rFonts w:ascii="新細明體" w:eastAsia="新細明體" w:hAnsi="新細明體" w:cs="Noto Sans CJK TC" w:hint="eastAsia"/>
@@ -3731,7 +3454,6 @@
               </w:rPr>
               <w:t>(    )</w:t>
             </w:r>
-            <w:proofErr w:type="gramEnd"/>
             <w:r>
               <w:rPr>
                 <w:rFonts w:ascii="新細明體" w:eastAsia="新細明體" w:hAnsi="新細明體" w:cs="Noto Sans CJK TC"/>
@@ -3747,23 +3469,6 @@
               </w:rPr>
               <w:t>7</w:t>
             </w:r>
-            <w:proofErr w:type="gramStart"/>
-            <w:r>
-              <w:rPr>
-                <w:rFonts w:ascii="新細明體" w:eastAsia="新細明體" w:hAnsi="新細明體" w:cs="Noto Sans CJK TC"/>
-                <w:b/>
-              </w:rPr>
-              <w:t>_</w:t>
-            </w:r>
-            <w:r>
-              <w:rPr>
-                <w:rFonts w:ascii="新細明體" w:eastAsia="新細明體" w:hAnsi="新細明體" w:cs="Noto Sans CJK TC" w:hint="eastAsia"/>
-                <w:b/>
-                <w:lang w:eastAsia="zh-CN"/>
-              </w:rPr>
-              <w:t>(    )</w:t>
-            </w:r>
-            <w:proofErr w:type="gramEnd"/>
           </w:p>
         </w:tc>
         <w:tc>
@@ -4059,7 +3764,6 @@
                 <w:b/>
               </w:rPr>
             </w:pPr>
-            <w:proofErr w:type="gramStart"/>
             <w:r>
               <w:rPr>
                 <w:rFonts w:ascii="新細明體" w:eastAsia="新細明體" w:hAnsi="新細明體" w:cs="Noto Sans CJK TC"/>
@@ -4073,27 +3777,8 @@
                 <w:b/>
                 <w:lang w:eastAsia="zh-CN"/>
               </w:rPr>
-              <w:t xml:space="preserve">(  </w:t>
+              <w:t>(     )</w:t>
             </w:r>
-            <w:proofErr w:type="gramEnd"/>
-            <w:r>
-              <w:rPr>
-                <w:rFonts w:ascii="新細明體" w:eastAsia="新細明體" w:hAnsi="新細明體" w:cs="Noto Sans CJK TC" w:hint="eastAsia"/>
-                <w:b/>
-                <w:lang w:eastAsia="zh-CN"/>
-              </w:rPr>
-              <w:t xml:space="preserve"> </w:t>
-            </w:r>
-            <w:proofErr w:type="gramStart"/>
-            <w:r>
-              <w:rPr>
-                <w:rFonts w:ascii="新細明體" w:eastAsia="新細明體" w:hAnsi="新細明體" w:cs="Noto Sans CJK TC" w:hint="eastAsia"/>
-                <w:b/>
-                <w:lang w:eastAsia="zh-CN"/>
-              </w:rPr>
-              <w:t xml:space="preserve">  )</w:t>
-            </w:r>
-            <w:proofErr w:type="gramEnd"/>
             <w:r>
               <w:rPr>
                 <w:rFonts w:ascii="新細明體" w:eastAsia="新細明體" w:hAnsi="新細明體" w:cs="Noto Sans CJK TC"/>
@@ -4101,7 +3786,6 @@
               </w:rPr>
               <w:t xml:space="preserve">_GROUP </w:t>
             </w:r>
-            <w:proofErr w:type="gramStart"/>
             <w:r>
               <w:rPr>
                 <w:rFonts w:ascii="新細明體" w:eastAsia="新細明體" w:hAnsi="新細明體" w:cs="Noto Sans CJK TC" w:hint="eastAsia"/>
@@ -4110,7 +3794,6 @@
               </w:rPr>
               <w:t>(    )</w:t>
             </w:r>
-            <w:proofErr w:type="gramEnd"/>
             <w:r>
               <w:rPr>
                 <w:rFonts w:ascii="新細明體" w:eastAsia="新細明體" w:hAnsi="新細明體" w:cs="Noto Sans CJK TC"/>
@@ -4126,23 +3809,6 @@
               </w:rPr>
               <w:t>8</w:t>
             </w:r>
-            <w:proofErr w:type="gramStart"/>
-            <w:r>
-              <w:rPr>
-                <w:rFonts w:ascii="新細明體" w:eastAsia="新細明體" w:hAnsi="新細明體" w:cs="Noto Sans CJK TC"/>
-                <w:b/>
-              </w:rPr>
-              <w:t>_</w:t>
-            </w:r>
-            <w:r>
-              <w:rPr>
-                <w:rFonts w:ascii="新細明體" w:eastAsia="新細明體" w:hAnsi="新細明體" w:cs="Noto Sans CJK TC" w:hint="eastAsia"/>
-                <w:b/>
-                <w:lang w:eastAsia="zh-CN"/>
-              </w:rPr>
-              <w:t>(    )</w:t>
-            </w:r>
-            <w:proofErr w:type="gramEnd"/>
           </w:p>
         </w:tc>
         <w:tc>
@@ -4438,7 +4104,6 @@
                 <w:b/>
               </w:rPr>
             </w:pPr>
-            <w:proofErr w:type="gramStart"/>
             <w:r>
               <w:rPr>
                 <w:rFonts w:ascii="新細明體" w:eastAsia="新細明體" w:hAnsi="新細明體" w:cs="Noto Sans CJK TC"/>
@@ -4452,27 +4117,8 @@
                 <w:b/>
                 <w:lang w:eastAsia="zh-CN"/>
               </w:rPr>
-              <w:t xml:space="preserve">(  </w:t>
+              <w:t>(     )</w:t>
             </w:r>
-            <w:proofErr w:type="gramEnd"/>
-            <w:r>
-              <w:rPr>
-                <w:rFonts w:ascii="新細明體" w:eastAsia="新細明體" w:hAnsi="新細明體" w:cs="Noto Sans CJK TC" w:hint="eastAsia"/>
-                <w:b/>
-                <w:lang w:eastAsia="zh-CN"/>
-              </w:rPr>
-              <w:t xml:space="preserve"> </w:t>
-            </w:r>
-            <w:proofErr w:type="gramStart"/>
-            <w:r>
-              <w:rPr>
-                <w:rFonts w:ascii="新細明體" w:eastAsia="新細明體" w:hAnsi="新細明體" w:cs="Noto Sans CJK TC" w:hint="eastAsia"/>
-                <w:b/>
-                <w:lang w:eastAsia="zh-CN"/>
-              </w:rPr>
-              <w:t xml:space="preserve">  )</w:t>
-            </w:r>
-            <w:proofErr w:type="gramEnd"/>
             <w:r>
               <w:rPr>
                 <w:rFonts w:ascii="新細明體" w:eastAsia="新細明體" w:hAnsi="新細明體" w:cs="Noto Sans CJK TC"/>
@@ -4480,7 +4126,6 @@
               </w:rPr>
               <w:t xml:space="preserve">_GROUP </w:t>
             </w:r>
-            <w:proofErr w:type="gramStart"/>
             <w:r>
               <w:rPr>
                 <w:rFonts w:ascii="新細明體" w:eastAsia="新細明體" w:hAnsi="新細明體" w:cs="Noto Sans CJK TC" w:hint="eastAsia"/>
@@ -4489,7 +4134,6 @@
               </w:rPr>
               <w:t>(    )</w:t>
             </w:r>
-            <w:proofErr w:type="gramEnd"/>
             <w:r>
               <w:rPr>
                 <w:rFonts w:ascii="新細明體" w:eastAsia="新細明體" w:hAnsi="新細明體" w:cs="Noto Sans CJK TC"/>
@@ -4505,23 +4149,6 @@
               </w:rPr>
               <w:t>9</w:t>
             </w:r>
-            <w:proofErr w:type="gramStart"/>
-            <w:r>
-              <w:rPr>
-                <w:rFonts w:ascii="新細明體" w:eastAsia="新細明體" w:hAnsi="新細明體" w:cs="Noto Sans CJK TC"/>
-                <w:b/>
-              </w:rPr>
-              <w:t>_</w:t>
-            </w:r>
-            <w:r>
-              <w:rPr>
-                <w:rFonts w:ascii="新細明體" w:eastAsia="新細明體" w:hAnsi="新細明體" w:cs="Noto Sans CJK TC" w:hint="eastAsia"/>
-                <w:b/>
-                <w:lang w:eastAsia="zh-CN"/>
-              </w:rPr>
-              <w:t>(    )</w:t>
-            </w:r>
-            <w:proofErr w:type="gramEnd"/>
           </w:p>
         </w:tc>
         <w:tc>
@@ -4817,7 +4444,6 @@
                 <w:b/>
               </w:rPr>
             </w:pPr>
-            <w:proofErr w:type="gramStart"/>
             <w:r>
               <w:rPr>
                 <w:rFonts w:ascii="新細明體" w:eastAsia="新細明體" w:hAnsi="新細明體" w:cs="Noto Sans CJK TC"/>
@@ -4831,27 +4457,8 @@
                 <w:b/>
                 <w:lang w:eastAsia="zh-CN"/>
               </w:rPr>
-              <w:t xml:space="preserve">(  </w:t>
+              <w:t>(     )</w:t>
             </w:r>
-            <w:proofErr w:type="gramEnd"/>
-            <w:r>
-              <w:rPr>
-                <w:rFonts w:ascii="新細明體" w:eastAsia="新細明體" w:hAnsi="新細明體" w:cs="Noto Sans CJK TC" w:hint="eastAsia"/>
-                <w:b/>
-                <w:lang w:eastAsia="zh-CN"/>
-              </w:rPr>
-              <w:t xml:space="preserve"> </w:t>
-            </w:r>
-            <w:proofErr w:type="gramStart"/>
-            <w:r>
-              <w:rPr>
-                <w:rFonts w:ascii="新細明體" w:eastAsia="新細明體" w:hAnsi="新細明體" w:cs="Noto Sans CJK TC" w:hint="eastAsia"/>
-                <w:b/>
-                <w:lang w:eastAsia="zh-CN"/>
-              </w:rPr>
-              <w:t xml:space="preserve">  )</w:t>
-            </w:r>
-            <w:proofErr w:type="gramEnd"/>
             <w:r>
               <w:rPr>
                 <w:rFonts w:ascii="新細明體" w:eastAsia="新細明體" w:hAnsi="新細明體" w:cs="Noto Sans CJK TC"/>
@@ -4859,7 +4466,6 @@
               </w:rPr>
               <w:t xml:space="preserve">_GROUP </w:t>
             </w:r>
-            <w:proofErr w:type="gramStart"/>
             <w:r>
               <w:rPr>
                 <w:rFonts w:ascii="新細明體" w:eastAsia="新細明體" w:hAnsi="新細明體" w:cs="Noto Sans CJK TC" w:hint="eastAsia"/>
@@ -4868,7 +4474,6 @@
               </w:rPr>
               <w:t>(    )</w:t>
             </w:r>
-            <w:proofErr w:type="gramEnd"/>
             <w:r>
               <w:rPr>
                 <w:rFonts w:ascii="新細明體" w:eastAsia="新細明體" w:hAnsi="新細明體" w:cs="Noto Sans CJK TC"/>
@@ -4883,31 +4488,6 @@
                 <w:lang w:eastAsia="zh-CN"/>
               </w:rPr>
               <w:t>10</w:t>
-            </w:r>
-            <w:proofErr w:type="gramStart"/>
-            <w:r>
-              <w:rPr>
-                <w:rFonts w:ascii="新細明體" w:eastAsia="新細明體" w:hAnsi="新細明體" w:cs="Noto Sans CJK TC"/>
-                <w:b/>
-              </w:rPr>
-              <w:t>_</w:t>
-            </w:r>
-            <w:r>
-              <w:rPr>
-                <w:rFonts w:ascii="新細明體" w:eastAsia="新細明體" w:hAnsi="新細明體" w:cs="Noto Sans CJK TC" w:hint="eastAsia"/>
-                <w:b/>
-                <w:lang w:eastAsia="zh-CN"/>
-              </w:rPr>
-              <w:t xml:space="preserve">(  </w:t>
-            </w:r>
-            <w:proofErr w:type="gramEnd"/>
-            <w:r>
-              <w:rPr>
-                <w:rFonts w:ascii="新細明體" w:eastAsia="新細明體" w:hAnsi="新細明體" w:cs="Noto Sans CJK TC" w:hint="eastAsia"/>
-                <w:b/>
-                <w:lang w:eastAsia="zh-CN"/>
-              </w:rPr>
-              <w:t xml:space="preserve"> )</w:t>
             </w:r>
           </w:p>
         </w:tc>
@@ -5214,7 +4794,6 @@
                 <w:lang w:eastAsia="zh-CN"/>
               </w:rPr>
             </w:pPr>
-            <w:proofErr w:type="gramStart"/>
             <w:r>
               <w:rPr>
                 <w:rFonts w:ascii="新細明體" w:eastAsia="新細明體" w:hAnsi="新細明體" w:cs="Noto Sans CJK TC"/>
@@ -5228,27 +4807,8 @@
                 <w:b/>
                 <w:lang w:eastAsia="zh-CN"/>
               </w:rPr>
-              <w:t xml:space="preserve">(  </w:t>
+              <w:t>(     )</w:t>
             </w:r>
-            <w:proofErr w:type="gramEnd"/>
-            <w:r>
-              <w:rPr>
-                <w:rFonts w:ascii="新細明體" w:eastAsia="新細明體" w:hAnsi="新細明體" w:cs="Noto Sans CJK TC" w:hint="eastAsia"/>
-                <w:b/>
-                <w:lang w:eastAsia="zh-CN"/>
-              </w:rPr>
-              <w:t xml:space="preserve"> </w:t>
-            </w:r>
-            <w:proofErr w:type="gramStart"/>
-            <w:r>
-              <w:rPr>
-                <w:rFonts w:ascii="新細明體" w:eastAsia="新細明體" w:hAnsi="新細明體" w:cs="Noto Sans CJK TC" w:hint="eastAsia"/>
-                <w:b/>
-                <w:lang w:eastAsia="zh-CN"/>
-              </w:rPr>
-              <w:t xml:space="preserve">  )</w:t>
-            </w:r>
-            <w:proofErr w:type="gramEnd"/>
             <w:r>
               <w:rPr>
                 <w:rFonts w:ascii="新細明體" w:eastAsia="新細明體" w:hAnsi="新細明體" w:cs="Noto Sans CJK TC"/>
@@ -5256,7 +4816,6 @@
               </w:rPr>
               <w:t xml:space="preserve">_GROUP </w:t>
             </w:r>
-            <w:proofErr w:type="gramStart"/>
             <w:r>
               <w:rPr>
                 <w:rFonts w:ascii="新細明體" w:eastAsia="新細明體" w:hAnsi="新細明體" w:cs="Noto Sans CJK TC" w:hint="eastAsia"/>
@@ -5265,7 +4824,6 @@
               </w:rPr>
               <w:t>(    )</w:t>
             </w:r>
-            <w:proofErr w:type="gramEnd"/>
             <w:r>
               <w:rPr>
                 <w:rFonts w:ascii="新細明體" w:eastAsia="新細明體" w:hAnsi="新細明體" w:cs="Noto Sans CJK TC"/>
@@ -5280,31 +4838,6 @@
                 <w:lang w:eastAsia="zh-CN"/>
               </w:rPr>
               <w:t>11</w:t>
-            </w:r>
-            <w:proofErr w:type="gramStart"/>
-            <w:r>
-              <w:rPr>
-                <w:rFonts w:ascii="新細明體" w:eastAsia="新細明體" w:hAnsi="新細明體" w:cs="Noto Sans CJK TC"/>
-                <w:b/>
-              </w:rPr>
-              <w:t>_</w:t>
-            </w:r>
-            <w:r>
-              <w:rPr>
-                <w:rFonts w:ascii="新細明體" w:eastAsia="新細明體" w:hAnsi="新細明體" w:cs="Noto Sans CJK TC" w:hint="eastAsia"/>
-                <w:b/>
-                <w:lang w:eastAsia="zh-CN"/>
-              </w:rPr>
-              <w:t xml:space="preserve">(  </w:t>
-            </w:r>
-            <w:proofErr w:type="gramEnd"/>
-            <w:r>
-              <w:rPr>
-                <w:rFonts w:ascii="新細明體" w:eastAsia="新細明體" w:hAnsi="新細明體" w:cs="Noto Sans CJK TC" w:hint="eastAsia"/>
-                <w:b/>
-                <w:lang w:eastAsia="zh-CN"/>
-              </w:rPr>
-              <w:t xml:space="preserve"> )</w:t>
             </w:r>
           </w:p>
         </w:tc>
@@ -5609,7 +5142,6 @@
                 <w:b/>
               </w:rPr>
             </w:pPr>
-            <w:proofErr w:type="gramStart"/>
             <w:r>
               <w:rPr>
                 <w:rFonts w:ascii="新細明體" w:eastAsia="新細明體" w:hAnsi="新細明體" w:cs="Noto Sans CJK TC"/>
@@ -5623,27 +5155,8 @@
                 <w:b/>
                 <w:lang w:eastAsia="zh-CN"/>
               </w:rPr>
-              <w:t xml:space="preserve">(  </w:t>
+              <w:t>(     )</w:t>
             </w:r>
-            <w:proofErr w:type="gramEnd"/>
-            <w:r>
-              <w:rPr>
-                <w:rFonts w:ascii="新細明體" w:eastAsia="新細明體" w:hAnsi="新細明體" w:cs="Noto Sans CJK TC" w:hint="eastAsia"/>
-                <w:b/>
-                <w:lang w:eastAsia="zh-CN"/>
-              </w:rPr>
-              <w:t xml:space="preserve"> </w:t>
-            </w:r>
-            <w:proofErr w:type="gramStart"/>
-            <w:r>
-              <w:rPr>
-                <w:rFonts w:ascii="新細明體" w:eastAsia="新細明體" w:hAnsi="新細明體" w:cs="Noto Sans CJK TC" w:hint="eastAsia"/>
-                <w:b/>
-                <w:lang w:eastAsia="zh-CN"/>
-              </w:rPr>
-              <w:t xml:space="preserve">  )</w:t>
-            </w:r>
-            <w:proofErr w:type="gramEnd"/>
             <w:r>
               <w:rPr>
                 <w:rFonts w:ascii="新細明體" w:eastAsia="新細明體" w:hAnsi="新細明體" w:cs="Noto Sans CJK TC"/>
@@ -5651,7 +5164,6 @@
               </w:rPr>
               <w:t xml:space="preserve">_GROUP </w:t>
             </w:r>
-            <w:proofErr w:type="gramStart"/>
             <w:r>
               <w:rPr>
                 <w:rFonts w:ascii="新細明體" w:eastAsia="新細明體" w:hAnsi="新細明體" w:cs="Noto Sans CJK TC" w:hint="eastAsia"/>
@@ -5660,7 +5172,6 @@
               </w:rPr>
               <w:t>(    )</w:t>
             </w:r>
-            <w:proofErr w:type="gramEnd"/>
             <w:r>
               <w:rPr>
                 <w:rFonts w:ascii="新細明體" w:eastAsia="新細明體" w:hAnsi="新細明體" w:cs="Noto Sans CJK TC"/>
@@ -5683,31 +5194,6 @@
                 <w:lang w:eastAsia="zh-CN"/>
               </w:rPr>
               <w:t>2</w:t>
-            </w:r>
-            <w:proofErr w:type="gramStart"/>
-            <w:r>
-              <w:rPr>
-                <w:rFonts w:ascii="新細明體" w:eastAsia="新細明體" w:hAnsi="新細明體" w:cs="Noto Sans CJK TC"/>
-                <w:b/>
-              </w:rPr>
-              <w:t>_</w:t>
-            </w:r>
-            <w:r>
-              <w:rPr>
-                <w:rFonts w:ascii="新細明體" w:eastAsia="新細明體" w:hAnsi="新細明體" w:cs="Noto Sans CJK TC" w:hint="eastAsia"/>
-                <w:b/>
-                <w:lang w:eastAsia="zh-CN"/>
-              </w:rPr>
-              <w:t xml:space="preserve">(  </w:t>
-            </w:r>
-            <w:proofErr w:type="gramEnd"/>
-            <w:r>
-              <w:rPr>
-                <w:rFonts w:ascii="新細明體" w:eastAsia="新細明體" w:hAnsi="新細明體" w:cs="Noto Sans CJK TC" w:hint="eastAsia"/>
-                <w:b/>
-                <w:lang w:eastAsia="zh-CN"/>
-              </w:rPr>
-              <w:t xml:space="preserve"> )</w:t>
             </w:r>
           </w:p>
         </w:tc>
@@ -6012,7 +5498,6 @@
                 <w:b/>
               </w:rPr>
             </w:pPr>
-            <w:proofErr w:type="gramStart"/>
             <w:r>
               <w:rPr>
                 <w:rFonts w:ascii="新細明體" w:eastAsia="新細明體" w:hAnsi="新細明體" w:cs="Noto Sans CJK TC"/>
@@ -6026,27 +5511,8 @@
                 <w:b/>
                 <w:lang w:eastAsia="zh-CN"/>
               </w:rPr>
-              <w:t xml:space="preserve">(  </w:t>
+              <w:t>(     )</w:t>
             </w:r>
-            <w:proofErr w:type="gramEnd"/>
-            <w:r>
-              <w:rPr>
-                <w:rFonts w:ascii="新細明體" w:eastAsia="新細明體" w:hAnsi="新細明體" w:cs="Noto Sans CJK TC" w:hint="eastAsia"/>
-                <w:b/>
-                <w:lang w:eastAsia="zh-CN"/>
-              </w:rPr>
-              <w:t xml:space="preserve"> </w:t>
-            </w:r>
-            <w:proofErr w:type="gramStart"/>
-            <w:r>
-              <w:rPr>
-                <w:rFonts w:ascii="新細明體" w:eastAsia="新細明體" w:hAnsi="新細明體" w:cs="Noto Sans CJK TC" w:hint="eastAsia"/>
-                <w:b/>
-                <w:lang w:eastAsia="zh-CN"/>
-              </w:rPr>
-              <w:t xml:space="preserve">  )</w:t>
-            </w:r>
-            <w:proofErr w:type="gramEnd"/>
             <w:r>
               <w:rPr>
                 <w:rFonts w:ascii="新細明體" w:eastAsia="新細明體" w:hAnsi="新細明體" w:cs="Noto Sans CJK TC"/>
@@ -6054,7 +5520,6 @@
               </w:rPr>
               <w:t xml:space="preserve">_GROUP </w:t>
             </w:r>
-            <w:proofErr w:type="gramStart"/>
             <w:r>
               <w:rPr>
                 <w:rFonts w:ascii="新細明體" w:eastAsia="新細明體" w:hAnsi="新細明體" w:cs="Noto Sans CJK TC" w:hint="eastAsia"/>
@@ -6063,7 +5528,6 @@
               </w:rPr>
               <w:t>(    )</w:t>
             </w:r>
-            <w:proofErr w:type="gramEnd"/>
             <w:r>
               <w:rPr>
                 <w:rFonts w:ascii="新細明體" w:eastAsia="新細明體" w:hAnsi="新細明體" w:cs="Noto Sans CJK TC"/>
@@ -6086,31 +5550,6 @@
                 <w:lang w:eastAsia="zh-CN"/>
               </w:rPr>
               <w:t>3</w:t>
-            </w:r>
-            <w:proofErr w:type="gramStart"/>
-            <w:r>
-              <w:rPr>
-                <w:rFonts w:ascii="新細明體" w:eastAsia="新細明體" w:hAnsi="新細明體" w:cs="Noto Sans CJK TC"/>
-                <w:b/>
-              </w:rPr>
-              <w:t>_</w:t>
-            </w:r>
-            <w:r>
-              <w:rPr>
-                <w:rFonts w:ascii="新細明體" w:eastAsia="新細明體" w:hAnsi="新細明體" w:cs="Noto Sans CJK TC" w:hint="eastAsia"/>
-                <w:b/>
-                <w:lang w:eastAsia="zh-CN"/>
-              </w:rPr>
-              <w:t xml:space="preserve">(  </w:t>
-            </w:r>
-            <w:proofErr w:type="gramEnd"/>
-            <w:r>
-              <w:rPr>
-                <w:rFonts w:ascii="新細明體" w:eastAsia="新細明體" w:hAnsi="新細明體" w:cs="Noto Sans CJK TC" w:hint="eastAsia"/>
-                <w:b/>
-                <w:lang w:eastAsia="zh-CN"/>
-              </w:rPr>
-              <w:t xml:space="preserve"> )</w:t>
             </w:r>
           </w:p>
         </w:tc>
@@ -6417,7 +5856,6 @@
                 <w:b/>
               </w:rPr>
             </w:pPr>
-            <w:proofErr w:type="gramStart"/>
             <w:r>
               <w:rPr>
                 <w:rFonts w:ascii="新細明體" w:eastAsia="新細明體" w:hAnsi="新細明體" w:cs="Noto Sans CJK TC"/>
@@ -6431,27 +5869,8 @@
                 <w:b/>
                 <w:lang w:eastAsia="zh-CN"/>
               </w:rPr>
-              <w:t xml:space="preserve">(  </w:t>
+              <w:t>(     )</w:t>
             </w:r>
-            <w:proofErr w:type="gramEnd"/>
-            <w:r>
-              <w:rPr>
-                <w:rFonts w:ascii="新細明體" w:eastAsia="新細明體" w:hAnsi="新細明體" w:cs="Noto Sans CJK TC" w:hint="eastAsia"/>
-                <w:b/>
-                <w:lang w:eastAsia="zh-CN"/>
-              </w:rPr>
-              <w:t xml:space="preserve"> </w:t>
-            </w:r>
-            <w:proofErr w:type="gramStart"/>
-            <w:r>
-              <w:rPr>
-                <w:rFonts w:ascii="新細明體" w:eastAsia="新細明體" w:hAnsi="新細明體" w:cs="Noto Sans CJK TC" w:hint="eastAsia"/>
-                <w:b/>
-                <w:lang w:eastAsia="zh-CN"/>
-              </w:rPr>
-              <w:t xml:space="preserve">  )</w:t>
-            </w:r>
-            <w:proofErr w:type="gramEnd"/>
             <w:r>
               <w:rPr>
                 <w:rFonts w:ascii="新細明體" w:eastAsia="新細明體" w:hAnsi="新細明體" w:cs="Noto Sans CJK TC"/>
@@ -6459,7 +5878,6 @@
               </w:rPr>
               <w:t xml:space="preserve">_GROUP </w:t>
             </w:r>
-            <w:proofErr w:type="gramStart"/>
             <w:r>
               <w:rPr>
                 <w:rFonts w:ascii="新細明體" w:eastAsia="新細明體" w:hAnsi="新細明體" w:cs="Noto Sans CJK TC" w:hint="eastAsia"/>
@@ -6468,7 +5886,6 @@
               </w:rPr>
               <w:t>(    )</w:t>
             </w:r>
-            <w:proofErr w:type="gramEnd"/>
             <w:r>
               <w:rPr>
                 <w:rFonts w:ascii="新細明體" w:eastAsia="新細明體" w:hAnsi="新細明體" w:cs="Noto Sans CJK TC"/>
@@ -6491,31 +5908,6 @@
                 <w:lang w:eastAsia="zh-CN"/>
               </w:rPr>
               <w:t>4</w:t>
-            </w:r>
-            <w:proofErr w:type="gramStart"/>
-            <w:r>
-              <w:rPr>
-                <w:rFonts w:ascii="新細明體" w:eastAsia="新細明體" w:hAnsi="新細明體" w:cs="Noto Sans CJK TC"/>
-                <w:b/>
-              </w:rPr>
-              <w:t>_</w:t>
-            </w:r>
-            <w:r>
-              <w:rPr>
-                <w:rFonts w:ascii="新細明體" w:eastAsia="新細明體" w:hAnsi="新細明體" w:cs="Noto Sans CJK TC" w:hint="eastAsia"/>
-                <w:b/>
-                <w:lang w:eastAsia="zh-CN"/>
-              </w:rPr>
-              <w:t xml:space="preserve">(  </w:t>
-            </w:r>
-            <w:proofErr w:type="gramEnd"/>
-            <w:r>
-              <w:rPr>
-                <w:rFonts w:ascii="新細明體" w:eastAsia="新細明體" w:hAnsi="新細明體" w:cs="Noto Sans CJK TC" w:hint="eastAsia"/>
-                <w:b/>
-                <w:lang w:eastAsia="zh-CN"/>
-              </w:rPr>
-              <w:t xml:space="preserve"> )</w:t>
             </w:r>
           </w:p>
         </w:tc>
@@ -6822,7 +6214,6 @@
                 <w:b/>
               </w:rPr>
             </w:pPr>
-            <w:proofErr w:type="gramStart"/>
             <w:r>
               <w:rPr>
                 <w:rFonts w:ascii="新細明體" w:eastAsia="新細明體" w:hAnsi="新細明體" w:cs="Noto Sans CJK TC"/>
@@ -6836,27 +6227,8 @@
                 <w:b/>
                 <w:lang w:eastAsia="zh-CN"/>
               </w:rPr>
-              <w:t xml:space="preserve">(  </w:t>
+              <w:t>(     )</w:t>
             </w:r>
-            <w:proofErr w:type="gramEnd"/>
-            <w:r>
-              <w:rPr>
-                <w:rFonts w:ascii="新細明體" w:eastAsia="新細明體" w:hAnsi="新細明體" w:cs="Noto Sans CJK TC" w:hint="eastAsia"/>
-                <w:b/>
-                <w:lang w:eastAsia="zh-CN"/>
-              </w:rPr>
-              <w:t xml:space="preserve"> </w:t>
-            </w:r>
-            <w:proofErr w:type="gramStart"/>
-            <w:r>
-              <w:rPr>
-                <w:rFonts w:ascii="新細明體" w:eastAsia="新細明體" w:hAnsi="新細明體" w:cs="Noto Sans CJK TC" w:hint="eastAsia"/>
-                <w:b/>
-                <w:lang w:eastAsia="zh-CN"/>
-              </w:rPr>
-              <w:t xml:space="preserve">  )</w:t>
-            </w:r>
-            <w:proofErr w:type="gramEnd"/>
             <w:r>
               <w:rPr>
                 <w:rFonts w:ascii="新細明體" w:eastAsia="新細明體" w:hAnsi="新細明體" w:cs="Noto Sans CJK TC"/>
@@ -6864,7 +6236,6 @@
               </w:rPr>
               <w:t xml:space="preserve">_GROUP </w:t>
             </w:r>
-            <w:proofErr w:type="gramStart"/>
             <w:r>
               <w:rPr>
                 <w:rFonts w:ascii="新細明體" w:eastAsia="新細明體" w:hAnsi="新細明體" w:cs="Noto Sans CJK TC" w:hint="eastAsia"/>
@@ -6873,7 +6244,6 @@
               </w:rPr>
               <w:t>(    )</w:t>
             </w:r>
-            <w:proofErr w:type="gramEnd"/>
             <w:r>
               <w:rPr>
                 <w:rFonts w:ascii="新細明體" w:eastAsia="新細明體" w:hAnsi="新細明體" w:cs="Noto Sans CJK TC"/>
@@ -6897,30 +6267,12 @@
               </w:rPr>
               <w:t>5</w:t>
             </w:r>
-            <w:proofErr w:type="gramStart"/>
             <w:r>
               <w:rPr>
                 <w:rFonts w:ascii="新細明體" w:eastAsia="新細明體" w:hAnsi="新細明體" w:cs="Noto Sans CJK TC"/>
                 <w:b/>
               </w:rPr>
               <w:t>_</w:t>
-            </w:r>
-            <w:r>
-              <w:rPr>
-                <w:rFonts w:ascii="新細明體" w:eastAsia="新細明體" w:hAnsi="新細明體" w:cs="Noto Sans CJK TC" w:hint="eastAsia"/>
-                <w:b/>
-                <w:lang w:eastAsia="zh-CN"/>
-              </w:rPr>
-              <w:t xml:space="preserve">(  </w:t>
-            </w:r>
-            <w:proofErr w:type="gramEnd"/>
-            <w:r>
-              <w:rPr>
-                <w:rFonts w:ascii="新細明體" w:eastAsia="新細明體" w:hAnsi="新細明體" w:cs="Noto Sans CJK TC" w:hint="eastAsia"/>
-                <w:b/>
-                <w:lang w:eastAsia="zh-CN"/>
-              </w:rPr>
-              <w:t xml:space="preserve"> )</w:t>
             </w:r>
           </w:p>
         </w:tc>

</xml_diff>